<commit_message>
Add formal trend/segmented-regression analysis with HAC + bootstrap 95% intervals (its_analysis.py); integrate uncertainty into JA/EN manuscripts; docs
Co-Authored-By: Tatsuki Onishi <bougtoir@gmail.com>
</commit_message>
<xml_diff>
--- a/ndb-dea-drug-lag/output/manuscript_en.docx
+++ b/ndb-dea-drug-lag/output/manuscript_en.docx
@@ -116,7 +116,7 @@
         <w:t>1,3</w:t>
       </w:r>
       <w:r>
-        <w:t xml:space="preserve"> were used as intervention markers at fiscal-year resolution (Table 1). Analyses are descriptive; the full pipeline (download -&gt; build -&gt; analyze -&gt; figures) is openly reproducible.</w:t>
+        <w:t xml:space="preserve"> were used as intervention markers at fiscal-year resolution (Table 1).</w:t>
       </w:r>
     </w:p>
     <w:p>
@@ -754,6 +754,29 @@
       </w:tr>
     </w:tbl>
     <w:p>
+      <w:r>
+        <w:t>Statistical analysis. Because NDB begins in FY2014, coincident with IFN-free DAA availability, there is no pre-intervention baseline and a conventional pre/post interrupted time series is not identifiable; with 10 annual national observations we therefore fitted descriptive trend models. Total DAA dispensing was modelled by continuous segmented (broken-stick) log-linear regression with a knot at the observed peak fiscal year, estimating pre- and post-peak annual multiplicative rates of change; each IFN-based drug was modelled by exponential (log-linear) decay over fiscal years with positive dispensing. Uncertainty was expressed as heteroskedasticity- and autocorrelation-consistent (Newey-West, maxlags=1) 95% intervals</w:t>
+      </w:r>
+      <w:r>
+        <w:rPr>
+          <w:vertAlign w:val="superscript"/>
+        </w:rPr>
+        <w:t>4</w:t>
+      </w:r>
+      <w:r>
+        <w:t>, cross-checked by a residual bootstrap (10,000 resamples)</w:t>
+      </w:r>
+      <w:r>
+        <w:rPr>
+          <w:vertAlign w:val="superscript"/>
+        </w:rPr>
+        <w:t>5</w:t>
+      </w:r>
+      <w:r>
+        <w:t>. These quantify how fast dispensing changed and its uncertainty; they are not causal estimates. Analyses used Python (statsmodels); the full pipeline (download -&gt; build -&gt; analyze -&gt; figures) is openly reproducible.</w:t>
+      </w:r>
+    </w:p>
+    <w:p>
       <w:pPr>
         <w:pStyle w:val="Heading1"/>
       </w:pPr>
@@ -763,7 +786,7 @@
     </w:p>
     <w:p>
       <w:r>
-        <w:t>The interferon-based standard therapy collapsed after IFN-free DAAs became available (Fig. 1). Peginterferon dispensing fell 99.2% from FY2014 to FY2023, and ribavirin reached near-zero by FY2018.</w:t>
+        <w:t>The interferon-based standard therapy collapsed after IFN-free DAAs became available (Fig. 1). Peginterferon dispensing fell 99.2% from FY2014 to FY2023, and ribavirin reached near-zero by FY2018. In the trend models this corresponded to peginterferon declining 36% per year (95% CI 24-47%), ribavirin 76% per year (95% CI 60-85%; FY2014-FY2019), and conventional interferon 25% per year (95% CI 24-26%).</w:t>
       </w:r>
     </w:p>
     <w:p>
@@ -819,7 +842,7 @@
     </w:p>
     <w:p>
       <w:r>
-        <w:t>DAA use itself showed a surge-then-decay pattern (Fig. 2): total DAA dispensing peaked in FY2015 at 19.5 million units (+158% vs FY2014) and then declined 92% to 1.5 million units by FY2023, with successive products replacing earlier ones.</w:t>
+        <w:t>DAA use itself showed a surge-then-decay pattern (Fig. 2): total DAA dispensing peaked in FY2015 at 19.5 million units (+158% vs FY2014) and then declined 92% to 1.5 million units by FY2023, with successive products replacing earlier ones. In the segmented model, DAA dispensing declined 25% per year after the FY2015 peak (95% CI 20-29%), and the post-peak slope differed significantly from the pre-peak slope (P=0.003).</w:t>
       </w:r>
     </w:p>
     <w:p>
@@ -896,7 +919,7 @@
     </w:p>
     <w:p>
       <w:r>
-        <w:t>NDB Open Data begins in FY2014, the same period IFN-free DAAs launched, so there is no pre-DAA interferon baseline within NDB; the FY2014 value already reflects decline from the pre-2014 peak. The metric is dispensed quantity, not patient counts, and units differ across products, so the summed DAA quantity is not a patient count. Data are annual, precluding within-year interrupted time-series or formal causal estimation, and no control condition or placebo event is included.</w:t>
+        <w:t>NDB Open Data begins in FY2014, the same period IFN-free DAAs launched, so there is no pre-DAA interferon baseline within NDB; the FY2014 value already reflects decline from the pre-2014 peak. The metric is dispensed quantity, not patient counts, and units differ across products, so the summed DAA quantity is not a patient count. Data are annual, precluding within-year interrupted time-series or formal causal estimation; the reported trend rates carry wide uncertainty intervals given the small number of annual observations (n=10), and no control condition or placebo event is included.</w:t>
       </w:r>
     </w:p>
     <w:p>
@@ -955,6 +978,22 @@
       </w:pPr>
       <w:r>
         <w:t>3. Ministry of Health, Labour and Welfare / Central Social Insurance Medical Council (Chuikyo). NHI drug-price listings of direct-acting antivirals for hepatitis C (2014-2017).</w:t>
+      </w:r>
+    </w:p>
+    <w:p>
+      <w:pPr>
+        <w:ind w:left="432" w:hanging="432"/>
+      </w:pPr>
+      <w:r>
+        <w:t>4. Newey WK, West KD. A simple, positive semi-definite, heteroskedasticity and autocorrelation consistent covariance matrix. Econometrica. 1987;55(3):703-708.</w:t>
+      </w:r>
+    </w:p>
+    <w:p>
+      <w:pPr>
+        <w:ind w:left="432" w:hanging="432"/>
+      </w:pPr>
+      <w:r>
+        <w:t>5. Efron B, Tibshirani RJ. An Introduction to the Bootstrap. New York: Chapman &amp; Hall; 1993.</w:t>
       </w:r>
     </w:p>
     <w:sectPr>

</xml_diff>

<commit_message>
Address critical review: separate IFN-based first-gen PIs, add treatment-course sensitivity, COVID/pre-2014 caveats, soften unsourced claims
Co-Authored-By: Tatsuki Onishi <bougtoir@gmail.com>
</commit_message>
<xml_diff>
--- a/ndb-dea-drug-lag/output/manuscript_en.docx
+++ b/ndb-dea-drug-lag/output/manuscript_en.docx
@@ -45,7 +45,7 @@
         <w:t xml:space="preserve">Results: </w:t>
       </w:r>
       <w:r>
-        <w:t xml:space="preserve">Peginterferon dispensing fell 99.2% from FY2014 to FY2023; ribavirin reached near-zero by FY2018. Total DAA dispensing peaked in FY2015 (19.5 million units, +158% vs FY2014) and then fell 92% by FY2023. </w:t>
+        <w:t xml:space="preserve">Peginterferon dispensing fell 99.2% from FY2014 to FY2023; ribavirin reached near-zero by FY2018. Total DAA dispensing peaked in FY2015 (19.4 million units, +188% vs FY2014) and then fell 92% by FY2023. </w:t>
       </w:r>
       <w:r>
         <w:rPr>
@@ -107,7 +107,7 @@
         <w:t>2</w:t>
       </w:r>
       <w:r>
-        <w:t>, extracting the national total dispensed quantity (総計/処方数量) for each drug from the sex- and age-stratified prescription-drug tables (oral, topical, injectable). Drugs were classified by their actual product names into IFN-based standard therapy (peginterferon, ribavirin) and 12 interferon-free DAA products. Conventional interferon is reported separately because it is not hepatitis-C-specific. The metric is dispensed quantity (tablets/capsules for oral drugs, syringes/vials for injections), not a patient count, and is compared within a product over time. Official approval and NHI drug-price listing milestones</w:t>
+        <w:t>, extracting the national total dispensed quantity (総計/処方数量) for each drug from the sex- and age-stratified prescription-drug tables (oral, topical, injectable). Drugs were classified by their actual product names into IFN-based standard therapy (peginterferon, ribavirin) and 9 interferon-free DAA products. Three first-generation NS3/4A protease inhibitors (simeprevir, telaprevir, vaniprevir), which were used together with peginterferon and ribavirin rather than as interferon-free regimens, were tabulated separately and excluded from the DAA group. Conventional interferon is reported separately because it is not hepatitis-C-specific. The metric is dispensed quantity (tablets/capsules for oral drugs, syringes/vials for injections), not a patient count, and is compared within a product over time. Official approval and NHI drug-price listing milestones</w:t>
       </w:r>
       <w:r>
         <w:rPr>
@@ -842,7 +842,7 @@
     </w:p>
     <w:p>
       <w:r>
-        <w:t>DAA use itself showed a surge-then-decay pattern (Fig. 2): total DAA dispensing peaked in FY2015 at 19.5 million units (+158% vs FY2014) and then declined 92% to 1.5 million units by FY2023, with successive products replacing earlier ones. In the segmented model, DAA dispensing declined 25% per year after the FY2015 peak (95% CI 20-29%), and the post-peak slope differed significantly from the pre-peak slope (P=0.003).</w:t>
+        <w:t>DAA use itself showed a surge-then-decay pattern (Fig. 2): total DAA dispensing peaked in FY2015 at 19.4 million units (+188% vs FY2014) and then declined 92% to 1.5 million units by FY2023, with successive products replacing earlier ones. In the segmented model, DAA dispensing declined 25% per year after the FY2015 peak (95% CI 20-29%), and the post-peak slope differed significantly from the pre-peak slope (P=0.000).</w:t>
       </w:r>
     </w:p>
     <w:p>
@@ -897,6 +897,11 @@
       </w:r>
     </w:p>
     <w:p>
+      <w:r>
+        <w:t>To give a rough sense of the practical patient scale (dispensed quantity is not a patient count), we converted the dispensed quantity of each interferon-free DAA to approximate full treatment courses using documented per-course unit counts (daily dose x standard duration), counting one anchor component per two-drug regimen to avoid double-counting. This yields an estimated peak of about 89,858 courses in FY2015 and an estimated 265,914-297,637 courses over FY2014-FY2023 (duration-sensitivity range). These figures are explicit estimates dependent on the regimen assumptions and are not observed patient counts.</w:t>
+      </w:r>
+    </w:p>
+    <w:p>
       <w:pPr>
         <w:pStyle w:val="Heading1"/>
       </w:pPr>
@@ -906,7 +911,7 @@
     </w:p>
     <w:p>
       <w:r>
-        <w:t>For hepatitis C DAAs there was no population-level practical lag: the standard therapy was displaced within about two years of the announcements/listings, indicating that decision-makers reacted rapidly. The DAA surge-then-decay is consistent with a finite stock of long-waiting patients being cured in a burst (pent-up demand) rather than a steady replacement flow. This is descriptive evidence supporting the anticipation hypothesis; it does not by itself establish that media coverage caused individual treatment choices.</w:t>
+        <w:t>For hepatitis C DAAs there was no population-level practical lag: the standard therapy was displaced within about two years of the announcements/listings, indicating that decision-makers reacted rapidly. The DAA surge-then-decay is consistent with a finite stock of long-waiting patients being cured in a burst (pent-up demand) rather than a steady replacement flow. This is descriptive evidence supporting the anticipation hypothesis; it does not by itself establish that media coverage caused individual treatment choices. External pre-2014 utilization data (e.g. national hepatitis programmes or society statistics) would be needed to quantify the full pre-DAA interferon baseline and are outside NDB; our claim is therefore limited to the speed of within-NDB displacement.</w:t>
       </w:r>
     </w:p>
     <w:p>
@@ -919,7 +924,7 @@
     </w:p>
     <w:p>
       <w:r>
-        <w:t>NDB Open Data begins in FY2014, the same period IFN-free DAAs launched, so there is no pre-DAA interferon baseline within NDB; the FY2014 value already reflects decline from the pre-2014 peak. The metric is dispensed quantity, not patient counts, and units differ across products, so the summed DAA quantity is not a patient count. Data are annual, precluding within-year interrupted time-series or formal causal estimation; the reported trend rates carry wide uncertainty intervals given the small number of annual observations (n=10), and no control condition or placebo event is included.</w:t>
+        <w:t>NDB Open Data begins in FY2014, the same period IFN-free DAAs launched, so there is no pre-DAA interferon baseline within NDB; the FY2014 value already reflects decline from the pre-2014 peak. The metric is dispensed quantity, not patient counts, and units differ across products, so the summed DAA quantity is not a patient count. Data are annual, precluding within-year interrupted time-series or formal causal estimation; the reported trend rates carry wide uncertainty intervals given the small number of annual observations (n=10), and no control condition or placebo event is included. Secular changes from FY2020 onward, including the COVID-19 pandemic's effect on outpatient visits and prescribing, may also have influenced later dispensing and cannot be separated from the ongoing DAA decline.</w:t>
       </w:r>
     </w:p>
     <w:p>

</xml_diff>

<commit_message>
Add filled STROBE checklist; verify approval/NHI-listing dates to day precision (package inserts / Chuikyo)
Co-Authored-By: Tatsuki Onishi <bougtoir@gmail.com>
</commit_message>
<xml_diff>
--- a/ndb-dea-drug-lag/output/manuscript_en.docx
+++ b/ndb-dea-drug-lag/output/manuscript_en.docx
@@ -169,7 +169,7 @@
                 <w:b/>
                 <w:sz w:val="15"/>
               </w:rPr>
-              <w:t>Month</w:t>
+              <w:t>Date</w:t>
             </w:r>
           </w:p>
         </w:tc>
@@ -239,7 +239,7 @@
               <w:rPr>
                 <w:sz w:val="15"/>
               </w:rPr>
-              <w:t>2014-07</w:t>
+              <w:t>2014-07-04</w:t>
             </w:r>
           </w:p>
         </w:tc>
@@ -278,7 +278,7 @@
               <w:rPr>
                 <w:sz w:val="15"/>
               </w:rPr>
-              <w:t>Bristol-Myers Squibb K.K. press release 2014-07-04</w:t>
+              <w:t>承認年月日 2014-07-04 (スンベプラカプセル/ダクルインザ錠 添付文書); Bristol-Myers Squibb K.K. press release 2014-07-04</w:t>
             </w:r>
           </w:p>
         </w:tc>
@@ -306,7 +306,7 @@
               <w:rPr>
                 <w:sz w:val="15"/>
               </w:rPr>
-              <w:t>2014-09</w:t>
+              <w:t>2014-09-02</w:t>
             </w:r>
           </w:p>
         </w:tc>
@@ -345,7 +345,7 @@
               <w:rPr>
                 <w:sz w:val="15"/>
               </w:rPr>
-              <w:t>MHLW/Chuikyo NHI drug-price listing FY2014</w:t>
+              <w:t>薬価基準収載日 2014-09-02 (添付文書); 発売 2014-09-03 (BMS press release 2014-09-03)</w:t>
             </w:r>
           </w:p>
         </w:tc>
@@ -373,7 +373,7 @@
               <w:rPr>
                 <w:sz w:val="15"/>
               </w:rPr>
-              <w:t>2015-03</w:t>
+              <w:t>2015-03-26</w:t>
             </w:r>
           </w:p>
         </w:tc>
@@ -412,7 +412,7 @@
               <w:rPr>
                 <w:sz w:val="15"/>
               </w:rPr>
-              <w:t>PMDA new-drug approval / Gilead Sciences K.K. press release (2015-03)</w:t>
+              <w:t>ソバルディ錠 承認年月日 2015-03-26 (添付文書 / インタビューフォーム)</w:t>
             </w:r>
           </w:p>
         </w:tc>
@@ -440,7 +440,7 @@
               <w:rPr>
                 <w:sz w:val="15"/>
               </w:rPr>
-              <w:t>2015-05</w:t>
+              <w:t>2015-05-20</w:t>
             </w:r>
           </w:p>
         </w:tc>
@@ -479,7 +479,7 @@
               <w:rPr>
                 <w:sz w:val="15"/>
               </w:rPr>
-              <w:t>MHLW/Chuikyo NHI drug-price listing (2015-05)</w:t>
+              <w:t>薬価収載 2015-05-20 (中医協 2015-05-13 総会決定; 厚労省保険局医療課通知 保医発0519第1号)</w:t>
             </w:r>
           </w:p>
         </w:tc>
@@ -507,7 +507,7 @@
               <w:rPr>
                 <w:sz w:val="15"/>
               </w:rPr>
-              <w:t>2015-07</w:t>
+              <w:t>2015-07-03</w:t>
             </w:r>
           </w:p>
         </w:tc>
@@ -546,7 +546,7 @@
               <w:rPr>
                 <w:sz w:val="15"/>
               </w:rPr>
-              <w:t>PMDA new-drug approval / Gilead Sciences K.K. press release (2015-07)</w:t>
+              <w:t>MHLW 製造販売承認 2015-07-03 (朝日新聞 2015-07-04 報道; 添付文書)</w:t>
             </w:r>
           </w:p>
         </w:tc>
@@ -574,7 +574,7 @@
               <w:rPr>
                 <w:sz w:val="15"/>
               </w:rPr>
-              <w:t>2015-08</w:t>
+              <w:t>2015-08-31</w:t>
             </w:r>
           </w:p>
         </w:tc>
@@ -613,7 +613,7 @@
               <w:rPr>
                 <w:sz w:val="15"/>
               </w:rPr>
-              <w:t>MHLW/Chuikyo NHI drug-price listing (2015-08)</w:t>
+              <w:t>ハーボニー配合錠 薬価収載日 2015-08-31 (添付文書)</w:t>
             </w:r>
           </w:p>
         </w:tc>
@@ -641,7 +641,7 @@
               <w:rPr>
                 <w:sz w:val="15"/>
               </w:rPr>
-              <w:t>2017-09</w:t>
+              <w:t>2017-09-27</w:t>
             </w:r>
           </w:p>
         </w:tc>
@@ -680,7 +680,7 @@
               <w:rPr>
                 <w:sz w:val="15"/>
               </w:rPr>
-              <w:t>PMDA new-drug approval / AbbVie GK press release (2017-09)</w:t>
+              <w:t>製造販売承認 2017-09-27 (PMDA/MHLW; AbbVie GK)</w:t>
             </w:r>
           </w:p>
         </w:tc>
@@ -708,7 +708,7 @@
               <w:rPr>
                 <w:sz w:val="15"/>
               </w:rPr>
-              <w:t>2017-11</w:t>
+              <w:t>2017-11-22</w:t>
             </w:r>
           </w:p>
         </w:tc>
@@ -747,7 +747,7 @@
               <w:rPr>
                 <w:sz w:val="15"/>
               </w:rPr>
-              <w:t>MHLW/Chuikyo NHI drug-price listing (2017-11)</w:t>
+              <w:t>マヴィレット配合錠 薬価収載日 2017-11-22 (中医協 2017-11-15 総会決定; 添付文書); 発売 2017-11-27</w:t>
             </w:r>
           </w:p>
         </w:tc>

</xml_diff>